<commit_message>
Add AI security certificates to portfolio and resume
</commit_message>
<xml_diff>
--- a/Dauren_Koshkenbek_AI_Security_Resume.docx
+++ b/Dauren_Koshkenbek_AI_Security_Resume.docx
@@ -559,7 +559,7 @@
         <w:pStyle w:val="ResumeSection"/>
       </w:pPr>
       <w:r>
-        <w:t>EDUCATION AND TRAINING</w:t>
+        <w:t>EDUCATION</w:t>
       </w:r>
     </w:p>
     <w:p>
@@ -581,7 +581,32 @@
     </w:p>
     <w:p>
       <w:pPr>
-        <w:spacing w:before="40"/>
+        <w:pStyle w:val="ResumeSection"/>
+      </w:pPr>
+      <w:r>
+        <w:t>CERTIFICATIONS AND TRAINING</w:t>
+      </w:r>
+    </w:p>
+    <w:p>
+      <w:r>
+        <w:rPr>
+          <w:rFonts w:ascii="Arial" w:hAnsi="Arial" w:eastAsia="Arial" w:cs="Arial"/>
+          <w:b/>
+          <w:sz w:val="18"/>
+        </w:rPr>
+        <w:t>Certified Practitioner in Prompt Injection and Input Integrity</w:t>
+      </w:r>
+      <w:r>
+        <w:rPr>
+          <w:rFonts w:ascii="Arial" w:hAnsi="Arial" w:eastAsia="Arial" w:cs="Arial"/>
+          <w:sz w:val="18"/>
+        </w:rPr>
+        <w:t xml:space="preserve"> | DarkControl Certify, practitioner level, 15 Oct 2026</w:t>
+      </w:r>
+    </w:p>
+    <w:p>
+      <w:pPr>
+        <w:spacing w:before="20"/>
       </w:pPr>
       <w:r>
         <w:rPr>
@@ -601,7 +626,27 @@
     </w:p>
     <w:p>
       <w:pPr>
-        <w:spacing w:before="40"/>
+        <w:spacing w:before="20"/>
+      </w:pPr>
+      <w:r>
+        <w:rPr>
+          <w:rFonts w:ascii="Arial" w:hAnsi="Arial" w:eastAsia="Arial" w:cs="Arial"/>
+          <w:b/>
+          <w:sz w:val="18"/>
+        </w:rPr>
+        <w:t>Introduction to AI Security</w:t>
+      </w:r>
+      <w:r>
+        <w:rPr>
+          <w:rFonts w:ascii="Arial" w:hAnsi="Arial" w:eastAsia="Arial" w:cs="Arial"/>
+          <w:sz w:val="18"/>
+        </w:rPr>
+        <w:t xml:space="preserve"> | AI Security University, 2-hour course completion, 29 Sep 2026</w:t>
+      </w:r>
+    </w:p>
+    <w:p>
+      <w:pPr>
+        <w:spacing w:before="20"/>
       </w:pPr>
       <w:r>
         <w:rPr>
@@ -616,7 +661,47 @@
           <w:rFonts w:ascii="Arial" w:hAnsi="Arial" w:eastAsia="Arial" w:cs="Arial"/>
           <w:sz w:val="18"/>
         </w:rPr>
-        <w:t xml:space="preserve"> | Red Hat training</w:t>
+        <w:t xml:space="preserve"> | Red Hat, certificate of attendance, 11 Jul 2025</w:t>
+      </w:r>
+    </w:p>
+    <w:p>
+      <w:pPr>
+        <w:spacing w:before="20"/>
+      </w:pPr>
+      <w:r>
+        <w:rPr>
+          <w:rFonts w:ascii="Arial" w:hAnsi="Arial" w:eastAsia="Arial" w:cs="Arial"/>
+          <w:b/>
+          <w:sz w:val="18"/>
+        </w:rPr>
+        <w:t xml:space="preserve">LearnQuest / Coursera course certificates (6 Feb 2025): </w:t>
+      </w:r>
+      <w:r>
+        <w:rPr>
+          <w:rFonts w:ascii="Arial" w:hAnsi="Arial" w:eastAsia="Arial" w:cs="Arial"/>
+          <w:sz w:val="18"/>
+        </w:rPr>
+        <w:t>Securing Cloud and Hybrid Networks; Next-Generation Firewalls and Intrusion Prevention.</w:t>
+      </w:r>
+    </w:p>
+    <w:p>
+      <w:pPr>
+        <w:spacing w:before="20"/>
+      </w:pPr>
+      <w:r>
+        <w:rPr>
+          <w:rFonts w:ascii="Arial" w:hAnsi="Arial" w:eastAsia="Arial" w:cs="Arial"/>
+          <w:b/>
+          <w:sz w:val="18"/>
+        </w:rPr>
+        <w:t xml:space="preserve">IBM / Coursera course certificates (6 Feb 2025): </w:t>
+      </w:r>
+      <w:r>
+        <w:rPr>
+          <w:rFonts w:ascii="Arial" w:hAnsi="Arial" w:eastAsia="Arial" w:cs="Arial"/>
+          <w:sz w:val="18"/>
+        </w:rPr>
+        <w:t>Exploratory Data Analysis for Machine Learning; Supervised Machine Learning: Regression.</w:t>
       </w:r>
     </w:p>
     <w:sectPr>

</xml_diff>

<commit_message>
Restyle AI security resume as formal black and white document
</commit_message>
<xml_diff>
--- a/Dauren_Koshkenbek_AI_Security_Resume.docx
+++ b/Dauren_Koshkenbek_AI_Security_Resume.docx
@@ -5,13 +5,14 @@
     <w:p>
       <w:pPr>
         <w:pStyle w:val="Title"/>
+        <w:jc w:val="center"/>
       </w:pPr>
       <w:r>
         <w:rPr>
-          <w:rFonts w:ascii="Arial" w:hAnsi="Arial" w:eastAsia="Arial" w:cs="Arial"/>
+          <w:rFonts w:ascii="Times New Roman" w:hAnsi="Times New Roman" w:eastAsia="Times New Roman" w:cs="Times New Roman"/>
           <w:b/>
           <w:color w:val="000000"/>
-          <w:sz w:val="35"/>
+          <w:sz w:val="37"/>
         </w:rPr>
         <w:t>DAUREN KOSHKENBEK</w:t>
       </w:r>
@@ -19,65 +20,93 @@
     <w:p>
       <w:pPr>
         <w:pStyle w:val="ResumeSubtitle"/>
+        <w:jc w:val="center"/>
       </w:pPr>
       <w:r>
-        <w:t>SOC Analyst L1  |  AI Security Testing</w:t>
+        <w:rPr>
+          <w:rFonts w:ascii="Times New Roman" w:hAnsi="Times New Roman" w:eastAsia="Times New Roman" w:cs="Times New Roman"/>
+          <w:i/>
+          <w:color w:val="000000"/>
+          <w:sz w:val="18"/>
+        </w:rPr>
+        <w:t>SOC Analyst L1 | AI Security Testing</w:t>
       </w:r>
     </w:p>
     <w:p>
       <w:pPr>
         <w:pStyle w:val="ResumeContact"/>
+        <w:jc w:val="center"/>
       </w:pPr>
       <w:r>
-        <w:t xml:space="preserve">Astana, Kazakhstan  |  </w:t>
+        <w:rPr>
+          <w:rFonts w:ascii="Times New Roman" w:hAnsi="Times New Roman" w:eastAsia="Times New Roman" w:cs="Times New Roman"/>
+          <w:color w:val="000000"/>
+          <w:sz w:val="17"/>
+        </w:rPr>
+        <w:t xml:space="preserve">Astana, Kazakhstan | </w:t>
       </w:r>
       <w:hyperlink r:id="rId9">
         <w:r>
           <w:rPr>
-            <w:rFonts w:ascii="Arial" w:hAnsi="Arial"/>
+            <w:rFonts w:ascii="Times New Roman" w:hAnsi="Times New Roman"/>
             <w:sz w:val="18"/>
-            <w:color w:val="2B4058"/>
+            <w:color w:val="000000"/>
+            <w:u w:val="none"/>
           </w:rPr>
           <w:t>daurencd@gmail.com</w:t>
         </w:r>
       </w:hyperlink>
       <w:r>
-        <w:t xml:space="preserve">  |  </w:t>
+        <w:rPr>
+          <w:rFonts w:ascii="Times New Roman" w:hAnsi="Times New Roman" w:eastAsia="Times New Roman" w:cs="Times New Roman"/>
+          <w:color w:val="000000"/>
+          <w:sz w:val="17"/>
+        </w:rPr>
+        <w:t xml:space="preserve"> | </w:t>
       </w:r>
       <w:hyperlink r:id="rId10">
         <w:r>
           <w:rPr>
-            <w:rFonts w:ascii="Arial" w:hAnsi="Arial"/>
+            <w:rFonts w:ascii="Times New Roman" w:hAnsi="Times New Roman"/>
             <w:sz w:val="18"/>
-            <w:color w:val="2B4058"/>
+            <w:color w:val="000000"/>
+            <w:u w:val="none"/>
           </w:rPr>
-          <w:t>https://daurencd.xyz/</w:t>
+          <w:t>daurencd.xyz</w:t>
         </w:r>
       </w:hyperlink>
     </w:p>
     <w:p>
       <w:pPr>
         <w:pStyle w:val="ResumeContact"/>
+        <w:jc w:val="center"/>
       </w:pPr>
       <w:hyperlink r:id="rId11">
         <w:r>
           <w:rPr>
-            <w:rFonts w:ascii="Arial" w:hAnsi="Arial"/>
+            <w:rFonts w:ascii="Times New Roman" w:hAnsi="Times New Roman"/>
             <w:sz w:val="18"/>
-            <w:color w:val="2B4058"/>
+            <w:color w:val="000000"/>
+            <w:u w:val="none"/>
           </w:rPr>
           <w:t>github.com/daurencd01</w:t>
         </w:r>
       </w:hyperlink>
       <w:r>
-        <w:t xml:space="preserve">  |  </w:t>
+        <w:rPr>
+          <w:rFonts w:ascii="Times New Roman" w:hAnsi="Times New Roman" w:eastAsia="Times New Roman" w:cs="Times New Roman"/>
+          <w:color w:val="000000"/>
+          <w:sz w:val="17"/>
+        </w:rPr>
+        <w:t xml:space="preserve"> | </w:t>
       </w:r>
       <w:hyperlink r:id="rId12">
         <w:r>
           <w:rPr>
-            <w:rFonts w:ascii="Arial" w:hAnsi="Arial"/>
+            <w:rFonts w:ascii="Times New Roman" w:hAnsi="Times New Roman"/>
             <w:sz w:val="18"/>
-            <w:color w:val="2B4058"/>
+            <w:color w:val="000000"/>
+            <w:u w:val="none"/>
           </w:rPr>
           <w:t>linkedin.com/in/dauren-koshkenbek-6b90a9358</w:t>
         </w:r>
@@ -86,122 +115,80 @@
     <w:p>
       <w:pPr>
         <w:pStyle w:val="ResumeSection"/>
+        <w:pBdr>
+          <w:bottom w:val="single" w:sz="5" w:space="2" w:color="000000"/>
+        </w:pBdr>
       </w:pPr>
       <w:r>
+        <w:rPr>
+          <w:rFonts w:ascii="Times New Roman" w:hAnsi="Times New Roman" w:eastAsia="Times New Roman" w:cs="Times New Roman"/>
+          <w:b/>
+          <w:color w:val="000000"/>
+          <w:sz w:val="20"/>
+        </w:rPr>
         <w:t>PROFESSIONAL PROFILE</w:t>
       </w:r>
     </w:p>
     <w:p>
+      <w:pPr>
+        <w:jc w:val="both"/>
+      </w:pPr>
       <w:r>
-        <w:t>Cybersecurity graduate and SOC Analyst L1 with hands-on experience in security monitoring, alert triage, and analysis of network, endpoint, and system logs. Practical AI testing includes prompt-injection experiments and creating attack scenarios and test cases. Combines a defensive security foundation with Python, Docker, CLI, and YAML skills for structured security testing.</w:t>
+        <w:rPr>
+          <w:rFonts w:ascii="Times New Roman" w:hAnsi="Times New Roman" w:eastAsia="Times New Roman" w:cs="Times New Roman"/>
+          <w:color w:val="000000"/>
+          <w:sz w:val="19"/>
+        </w:rPr>
+        <w:t>Cybersecurity graduate and SOC Analyst L1 with hands-on experience in security monitoring, alert triage, and analysis of network, endpoint, and system logs. Practical AI testing includes prompt-injection experiments and creating repeatable attack scenarios and test cases. Uses Python, Docker, CLI, and YAML in structured security testing workflows.</w:t>
       </w:r>
     </w:p>
     <w:p>
       <w:pPr>
         <w:pStyle w:val="ResumeSection"/>
-      </w:pPr>
-      <w:r>
-        <w:t>TECHNICAL SKILLS</w:t>
-      </w:r>
-    </w:p>
-    <w:p>
-      <w:pPr>
-        <w:spacing w:after="20"/>
+        <w:pBdr>
+          <w:bottom w:val="single" w:sz="5" w:space="2" w:color="000000"/>
+        </w:pBdr>
       </w:pPr>
       <w:r>
         <w:rPr>
-          <w:rFonts w:ascii="Arial" w:hAnsi="Arial" w:eastAsia="Arial" w:cs="Arial"/>
+          <w:rFonts w:ascii="Times New Roman" w:hAnsi="Times New Roman" w:eastAsia="Times New Roman" w:cs="Times New Roman"/>
           <w:b/>
-          <w:sz w:val="18"/>
+          <w:color w:val="000000"/>
+          <w:sz w:val="20"/>
         </w:rPr>
-        <w:t xml:space="preserve">AI security testing: </w:t>
-      </w:r>
-      <w:r>
-        <w:rPr>
-          <w:rFonts w:ascii="Arial" w:hAnsi="Arial" w:eastAsia="Arial" w:cs="Arial"/>
-          <w:sz w:val="18"/>
-        </w:rPr>
-        <w:t>Prompt injection, adversarial testing, attack scenario design, security test cases, vulnerability analysis</w:t>
-      </w:r>
-    </w:p>
-    <w:p>
-      <w:pPr>
-        <w:spacing w:after="20"/>
-      </w:pPr>
-      <w:r>
-        <w:rPr>
-          <w:rFonts w:ascii="Arial" w:hAnsi="Arial" w:eastAsia="Arial" w:cs="Arial"/>
-          <w:b/>
-          <w:sz w:val="18"/>
-        </w:rPr>
-        <w:t xml:space="preserve">Security operations: </w:t>
-      </w:r>
-      <w:r>
-        <w:rPr>
-          <w:rFonts w:ascii="Arial" w:hAnsi="Arial" w:eastAsia="Arial" w:cs="Arial"/>
-          <w:sz w:val="18"/>
-        </w:rPr>
-        <w:t>Splunk SIEM, security event monitoring, log analysis, alert triage, incident investigation, network security</w:t>
-      </w:r>
-    </w:p>
-    <w:p>
-      <w:pPr>
-        <w:spacing w:after="20"/>
-      </w:pPr>
-      <w:r>
-        <w:rPr>
-          <w:rFonts w:ascii="Arial" w:hAnsi="Arial" w:eastAsia="Arial" w:cs="Arial"/>
-          <w:b/>
-          <w:sz w:val="18"/>
-        </w:rPr>
-        <w:t xml:space="preserve">Tools and scripting: </w:t>
-      </w:r>
-      <w:r>
-        <w:rPr>
-          <w:rFonts w:ascii="Arial" w:hAnsi="Arial" w:eastAsia="Arial" w:cs="Arial"/>
-          <w:sz w:val="18"/>
-        </w:rPr>
-        <w:t>Docker, command-line tools, YAML, Python, Linux, Git, Wireshark</w:t>
-      </w:r>
-    </w:p>
-    <w:p>
-      <w:pPr>
-        <w:pStyle w:val="ResumeSection"/>
-      </w:pPr>
-      <w:r>
         <w:t>AI SECURITY TESTING EXPERIENCE</w:t>
       </w:r>
     </w:p>
     <w:p>
       <w:pPr>
-        <w:tabs>
-          <w:tab w:pos="9936" w:val="right"/>
-        </w:tabs>
-        <w:spacing w:after="20"/>
+        <w:pStyle w:val="ResumeEntry"/>
       </w:pPr>
       <w:r>
         <w:rPr>
-          <w:rFonts w:ascii="Arial" w:hAnsi="Arial" w:eastAsia="Arial" w:cs="Arial"/>
+          <w:rFonts w:ascii="Times New Roman" w:hAnsi="Times New Roman" w:eastAsia="Times New Roman" w:cs="Times New Roman"/>
           <w:b/>
-          <w:sz w:val="18"/>
+          <w:color w:val="000000"/>
+          <w:sz w:val="19"/>
         </w:rPr>
         <w:t>AI testing internship</w:t>
       </w:r>
       <w:r>
         <w:rPr>
-          <w:rFonts w:ascii="Arial" w:hAnsi="Arial" w:eastAsia="Arial" w:cs="Arial"/>
-          <w:sz w:val="18"/>
+          <w:rFonts w:ascii="Times New Roman" w:hAnsi="Times New Roman" w:eastAsia="Times New Roman" w:cs="Times New Roman"/>
+          <w:color w:val="000000"/>
+          <w:sz w:val="19"/>
         </w:rPr>
-        <w:t xml:space="preserve"> | Astana Hub</w:t>
+        <w:t xml:space="preserve"> | Astana Hub, Kazakhstan</w:t>
       </w:r>
       <w:r>
         <w:rPr>
-          <w:rFonts w:ascii="Arial" w:hAnsi="Arial" w:eastAsia="Arial" w:cs="Arial"/>
-          <w:color w:val="4B5563"/>
+          <w:rFonts w:ascii="Times New Roman" w:hAnsi="Times New Roman" w:eastAsia="Times New Roman" w:cs="Times New Roman"/>
+          <w:i/>
+          <w:color w:val="000000"/>
           <w:sz w:val="18"/>
         </w:rPr>
         <w:tab/>
-        <w:t>Sep - Dec 2024</w:t>
+        <w:t>25 Sep - 20 Dec 2024</w:t>
       </w:r>
     </w:p>
     <w:p>
@@ -210,17 +197,19 @@
       </w:pPr>
       <w:r>
         <w:rPr>
-          <w:rFonts w:ascii="Arial" w:hAnsi="Arial" w:eastAsia="Arial" w:cs="Arial"/>
+          <w:rFonts w:ascii="Times New Roman" w:hAnsi="Times New Roman" w:eastAsia="Times New Roman" w:cs="Times New Roman"/>
+          <w:color w:val="000000"/>
           <w:sz w:val="18"/>
         </w:rPr>
-        <w:t xml:space="preserve">- </w:t>
+        <w:t xml:space="preserve">• </w:t>
       </w:r>
       <w:r>
         <w:rPr>
-          <w:rFonts w:ascii="Arial" w:hAnsi="Arial" w:eastAsia="Arial" w:cs="Arial"/>
+          <w:rFonts w:ascii="Times New Roman" w:hAnsi="Times New Roman" w:eastAsia="Times New Roman" w:cs="Times New Roman"/>
+          <w:color w:val="000000"/>
           <w:sz w:val="18"/>
         </w:rPr>
-        <w:t>Tested AI-system behavior with prompt-injection techniques and adversarial inputs during a university-arranged internship.</w:t>
+        <w:t>Tested AI-system behavior using prompt-injection techniques and adversarial inputs during a university-arranged internship.</w:t>
       </w:r>
     </w:p>
     <w:p>
@@ -229,50 +218,64 @@
       </w:pPr>
       <w:r>
         <w:rPr>
-          <w:rFonts w:ascii="Arial" w:hAnsi="Arial" w:eastAsia="Arial" w:cs="Arial"/>
+          <w:rFonts w:ascii="Times New Roman" w:hAnsi="Times New Roman" w:eastAsia="Times New Roman" w:cs="Times New Roman"/>
+          <w:color w:val="000000"/>
           <w:sz w:val="18"/>
         </w:rPr>
-        <w:t xml:space="preserve">- </w:t>
+        <w:t xml:space="preserve">• </w:t>
       </w:r>
       <w:r>
         <w:rPr>
-          <w:rFonts w:ascii="Arial" w:hAnsi="Arial" w:eastAsia="Arial" w:cs="Arial"/>
+          <w:rFonts w:ascii="Times New Roman" w:hAnsi="Times New Roman" w:eastAsia="Times New Roman" w:cs="Times New Roman"/>
+          <w:color w:val="000000"/>
           <w:sz w:val="18"/>
         </w:rPr>
-        <w:t>Created attack scenarios and security test cases for repeatable evaluation of model responses.</w:t>
+        <w:t>Created attack scenarios and security test cases to evaluate and document model responses reproducibly.</w:t>
       </w:r>
     </w:p>
     <w:p>
       <w:pPr>
         <w:pStyle w:val="ResumeSection"/>
+        <w:pBdr>
+          <w:bottom w:val="single" w:sz="5" w:space="2" w:color="000000"/>
+        </w:pBdr>
       </w:pPr>
       <w:r>
+        <w:rPr>
+          <w:rFonts w:ascii="Times New Roman" w:hAnsi="Times New Roman" w:eastAsia="Times New Roman" w:cs="Times New Roman"/>
+          <w:b/>
+          <w:color w:val="000000"/>
+          <w:sz w:val="20"/>
+        </w:rPr>
         <w:t>PROFESSIONAL EXPERIENCE</w:t>
       </w:r>
     </w:p>
     <w:p>
       <w:pPr>
-        <w:pStyle w:val="ResumeJob"/>
+        <w:pStyle w:val="ResumeEntry"/>
       </w:pPr>
       <w:r>
         <w:rPr>
-          <w:rFonts w:ascii="Arial" w:hAnsi="Arial" w:eastAsia="Arial" w:cs="Arial"/>
+          <w:rFonts w:ascii="Times New Roman" w:hAnsi="Times New Roman" w:eastAsia="Times New Roman" w:cs="Times New Roman"/>
           <w:b/>
-          <w:sz w:val="18"/>
+          <w:color w:val="000000"/>
+          <w:sz w:val="19"/>
         </w:rPr>
         <w:t>SOC Analyst L1</w:t>
       </w:r>
       <w:r>
         <w:rPr>
-          <w:rFonts w:ascii="Arial" w:hAnsi="Arial" w:eastAsia="Arial" w:cs="Arial"/>
-          <w:sz w:val="18"/>
+          <w:rFonts w:ascii="Times New Roman" w:hAnsi="Times New Roman" w:eastAsia="Times New Roman" w:cs="Times New Roman"/>
+          <w:color w:val="000000"/>
+          <w:sz w:val="19"/>
         </w:rPr>
         <w:t xml:space="preserve"> | Sauyt Lab (Freedom), Kazakhstan</w:t>
       </w:r>
       <w:r>
         <w:rPr>
-          <w:rFonts w:ascii="Arial" w:hAnsi="Arial" w:eastAsia="Arial" w:cs="Arial"/>
-          <w:color w:val="4B5563"/>
+          <w:rFonts w:ascii="Times New Roman" w:hAnsi="Times New Roman" w:eastAsia="Times New Roman" w:cs="Times New Roman"/>
+          <w:i/>
+          <w:color w:val="000000"/>
           <w:sz w:val="18"/>
         </w:rPr>
         <w:tab/>
@@ -285,17 +288,19 @@
       </w:pPr>
       <w:r>
         <w:rPr>
-          <w:rFonts w:ascii="Arial" w:hAnsi="Arial" w:eastAsia="Arial" w:cs="Arial"/>
+          <w:rFonts w:ascii="Times New Roman" w:hAnsi="Times New Roman" w:eastAsia="Times New Roman" w:cs="Times New Roman"/>
+          <w:color w:val="000000"/>
           <w:sz w:val="18"/>
         </w:rPr>
-        <w:t xml:space="preserve">- </w:t>
+        <w:t xml:space="preserve">• </w:t>
       </w:r>
       <w:r>
         <w:rPr>
-          <w:rFonts w:ascii="Arial" w:hAnsi="Arial" w:eastAsia="Arial" w:cs="Arial"/>
+          <w:rFonts w:ascii="Times New Roman" w:hAnsi="Times New Roman" w:eastAsia="Times New Roman" w:cs="Times New Roman"/>
+          <w:color w:val="000000"/>
           <w:sz w:val="18"/>
         </w:rPr>
-        <w:t>Monitor security events and triage alerts with Splunk SIEM; analyze network, endpoint, and system logs.</w:t>
+        <w:t>Monitor events and triage alerts in Splunk SIEM; analyze network, endpoint, and system logs.</w:t>
       </w:r>
     </w:p>
     <w:p>
@@ -304,42 +309,47 @@
       </w:pPr>
       <w:r>
         <w:rPr>
-          <w:rFonts w:ascii="Arial" w:hAnsi="Arial" w:eastAsia="Arial" w:cs="Arial"/>
+          <w:rFonts w:ascii="Times New Roman" w:hAnsi="Times New Roman" w:eastAsia="Times New Roman" w:cs="Times New Roman"/>
+          <w:color w:val="000000"/>
           <w:sz w:val="18"/>
         </w:rPr>
-        <w:t xml:space="preserve">- </w:t>
+        <w:t xml:space="preserve">• </w:t>
       </w:r>
       <w:r>
         <w:rPr>
-          <w:rFonts w:ascii="Arial" w:hAnsi="Arial" w:eastAsia="Arial" w:cs="Arial"/>
+          <w:rFonts w:ascii="Times New Roman" w:hAnsi="Times New Roman" w:eastAsia="Times New Roman" w:cs="Times New Roman"/>
+          <w:color w:val="000000"/>
           <w:sz w:val="18"/>
         </w:rPr>
-        <w:t>Conduct initial investigation of suspicious activity and potential indicators of compromise; escalate suspected incidents.</w:t>
+        <w:t>Investigate suspicious activity and potential indicators of compromise; escalate suspected incidents.</w:t>
       </w:r>
     </w:p>
     <w:p>
       <w:pPr>
-        <w:pStyle w:val="ResumeJob"/>
+        <w:pStyle w:val="ResumeEntry"/>
       </w:pPr>
       <w:r>
         <w:rPr>
-          <w:rFonts w:ascii="Arial" w:hAnsi="Arial" w:eastAsia="Arial" w:cs="Arial"/>
+          <w:rFonts w:ascii="Times New Roman" w:hAnsi="Times New Roman" w:eastAsia="Times New Roman" w:cs="Times New Roman"/>
           <w:b/>
-          <w:sz w:val="18"/>
+          <w:color w:val="000000"/>
+          <w:sz w:val="19"/>
         </w:rPr>
         <w:t>SOC Analyst L1</w:t>
       </w:r>
       <w:r>
         <w:rPr>
-          <w:rFonts w:ascii="Arial" w:hAnsi="Arial" w:eastAsia="Arial" w:cs="Arial"/>
-          <w:sz w:val="18"/>
+          <w:rFonts w:ascii="Times New Roman" w:hAnsi="Times New Roman" w:eastAsia="Times New Roman" w:cs="Times New Roman"/>
+          <w:color w:val="000000"/>
+          <w:sz w:val="19"/>
         </w:rPr>
         <w:t xml:space="preserve"> | Sr Holding, China</w:t>
       </w:r>
       <w:r>
         <w:rPr>
-          <w:rFonts w:ascii="Arial" w:hAnsi="Arial" w:eastAsia="Arial" w:cs="Arial"/>
-          <w:color w:val="4B5563"/>
+          <w:rFonts w:ascii="Times New Roman" w:hAnsi="Times New Roman" w:eastAsia="Times New Roman" w:cs="Times New Roman"/>
+          <w:i/>
+          <w:color w:val="000000"/>
           <w:sz w:val="18"/>
         </w:rPr>
         <w:tab/>
@@ -352,17 +362,19 @@
       </w:pPr>
       <w:r>
         <w:rPr>
-          <w:rFonts w:ascii="Arial" w:hAnsi="Arial" w:eastAsia="Arial" w:cs="Arial"/>
+          <w:rFonts w:ascii="Times New Roman" w:hAnsi="Times New Roman" w:eastAsia="Times New Roman" w:cs="Times New Roman"/>
+          <w:color w:val="000000"/>
           <w:sz w:val="18"/>
         </w:rPr>
-        <w:t xml:space="preserve">- </w:t>
+        <w:t xml:space="preserve">• </w:t>
       </w:r>
       <w:r>
         <w:rPr>
-          <w:rFonts w:ascii="Arial" w:hAnsi="Arial" w:eastAsia="Arial" w:cs="Arial"/>
+          <w:rFonts w:ascii="Times New Roman" w:hAnsi="Times New Roman" w:eastAsia="Times New Roman" w:cs="Times New Roman"/>
+          <w:color w:val="000000"/>
           <w:sz w:val="18"/>
         </w:rPr>
-        <w:t>Monitored security events in an international SOC and analyzed network, endpoint, and system logs.</w:t>
+        <w:t>Monitored security events and analyzed network, endpoint, and system logs in an international SOC.</w:t>
       </w:r>
     </w:p>
     <w:p>
@@ -371,42 +383,47 @@
       </w:pPr>
       <w:r>
         <w:rPr>
-          <w:rFonts w:ascii="Arial" w:hAnsi="Arial" w:eastAsia="Arial" w:cs="Arial"/>
+          <w:rFonts w:ascii="Times New Roman" w:hAnsi="Times New Roman" w:eastAsia="Times New Roman" w:cs="Times New Roman"/>
+          <w:color w:val="000000"/>
           <w:sz w:val="18"/>
         </w:rPr>
-        <w:t xml:space="preserve">- </w:t>
+        <w:t xml:space="preserve">• </w:t>
       </w:r>
       <w:r>
         <w:rPr>
-          <w:rFonts w:ascii="Arial" w:hAnsi="Arial" w:eastAsia="Arial" w:cs="Arial"/>
+          <w:rFonts w:ascii="Times New Roman" w:hAnsi="Times New Roman" w:eastAsia="Times New Roman" w:cs="Times New Roman"/>
+          <w:color w:val="000000"/>
           <w:sz w:val="18"/>
         </w:rPr>
-        <w:t>Triaged alerts, investigated incidents at first-line level, and escalated when required.</w:t>
+        <w:t>Triaged alerts and conducted first-line incident investigations before escalation.</w:t>
       </w:r>
     </w:p>
     <w:p>
       <w:pPr>
-        <w:pStyle w:val="ResumeJob"/>
+        <w:pStyle w:val="ResumeEntry"/>
       </w:pPr>
       <w:r>
         <w:rPr>
-          <w:rFonts w:ascii="Arial" w:hAnsi="Arial" w:eastAsia="Arial" w:cs="Arial"/>
+          <w:rFonts w:ascii="Times New Roman" w:hAnsi="Times New Roman" w:eastAsia="Times New Roman" w:cs="Times New Roman"/>
           <w:b/>
-          <w:sz w:val="18"/>
+          <w:color w:val="000000"/>
+          <w:sz w:val="19"/>
         </w:rPr>
         <w:t>Network Security Project Participant</w:t>
       </w:r>
       <w:r>
         <w:rPr>
-          <w:rFonts w:ascii="Arial" w:hAnsi="Arial" w:eastAsia="Arial" w:cs="Arial"/>
-          <w:sz w:val="18"/>
+          <w:rFonts w:ascii="Times New Roman" w:hAnsi="Times New Roman" w:eastAsia="Times New Roman" w:cs="Times New Roman"/>
+          <w:color w:val="000000"/>
+          <w:sz w:val="19"/>
         </w:rPr>
         <w:t xml:space="preserve"> | Kazakhtelecom (Sapa+), Kazakhstan</w:t>
       </w:r>
       <w:r>
         <w:rPr>
-          <w:rFonts w:ascii="Arial" w:hAnsi="Arial" w:eastAsia="Arial" w:cs="Arial"/>
-          <w:color w:val="4B5563"/>
+          <w:rFonts w:ascii="Times New Roman" w:hAnsi="Times New Roman" w:eastAsia="Times New Roman" w:cs="Times New Roman"/>
+          <w:i/>
+          <w:color w:val="000000"/>
           <w:sz w:val="18"/>
         </w:rPr>
         <w:tab/>
@@ -419,14 +436,16 @@
       </w:pPr>
       <w:r>
         <w:rPr>
-          <w:rFonts w:ascii="Arial" w:hAnsi="Arial" w:eastAsia="Arial" w:cs="Arial"/>
+          <w:rFonts w:ascii="Times New Roman" w:hAnsi="Times New Roman" w:eastAsia="Times New Roman" w:cs="Times New Roman"/>
+          <w:color w:val="000000"/>
           <w:sz w:val="18"/>
         </w:rPr>
-        <w:t xml:space="preserve">- </w:t>
+        <w:t xml:space="preserve">• </w:t>
       </w:r>
       <w:r>
         <w:rPr>
-          <w:rFonts w:ascii="Arial" w:hAnsi="Arial" w:eastAsia="Arial" w:cs="Arial"/>
+          <w:rFonts w:ascii="Times New Roman" w:hAnsi="Times New Roman" w:eastAsia="Times New Roman" w:cs="Times New Roman"/>
+          <w:color w:val="000000"/>
           <w:sz w:val="18"/>
         </w:rPr>
         <w:t>Supported secure network infrastructure and monitored network security events in a telecom environment.</w:t>
@@ -435,26 +454,18 @@
     <w:p>
       <w:pPr>
         <w:pStyle w:val="ResumeSection"/>
+        <w:pBdr>
+          <w:bottom w:val="single" w:sz="5" w:space="2" w:color="000000"/>
+        </w:pBdr>
       </w:pPr>
       <w:r>
+        <w:rPr>
+          <w:rFonts w:ascii="Times New Roman" w:hAnsi="Times New Roman" w:eastAsia="Times New Roman" w:cs="Times New Roman"/>
+          <w:b/>
+          <w:color w:val="000000"/>
+          <w:sz w:val="20"/>
+        </w:rPr>
         <w:t>SELECTED SECURITY PROJECTS</w:t>
-      </w:r>
-    </w:p>
-    <w:p>
-      <w:r>
-        <w:rPr>
-          <w:rFonts w:ascii="Arial" w:hAnsi="Arial" w:eastAsia="Arial" w:cs="Arial"/>
-          <w:b/>
-          <w:sz w:val="18"/>
-        </w:rPr>
-        <w:t>KD_SEC Security Tools</w:t>
-      </w:r>
-      <w:r>
-        <w:rPr>
-          <w:rFonts w:ascii="Arial" w:hAnsi="Arial" w:eastAsia="Arial" w:cs="Arial"/>
-          <w:sz w:val="18"/>
-        </w:rPr>
-        <w:t xml:space="preserve"> | Personal project</w:t>
       </w:r>
     </w:p>
     <w:p>
@@ -463,37 +474,28 @@
       </w:pPr>
       <w:r>
         <w:rPr>
-          <w:rFonts w:ascii="Arial" w:hAnsi="Arial" w:eastAsia="Arial" w:cs="Arial"/>
+          <w:rFonts w:ascii="Times New Roman" w:hAnsi="Times New Roman" w:eastAsia="Times New Roman" w:cs="Times New Roman"/>
+          <w:color w:val="000000"/>
           <w:sz w:val="18"/>
         </w:rPr>
-        <w:t xml:space="preserve">- </w:t>
+        <w:t xml:space="preserve">• </w:t>
       </w:r>
       <w:r>
         <w:rPr>
-          <w:rFonts w:ascii="Arial" w:hAnsi="Arial" w:eastAsia="Arial" w:cs="Arial"/>
+          <w:rFonts w:ascii="Times New Roman" w:hAnsi="Times New Roman" w:eastAsia="Times New Roman" w:cs="Times New Roman"/>
+          <w:b/>
+          <w:color w:val="000000"/>
           <w:sz w:val="18"/>
         </w:rPr>
-        <w:t>Built passive web security checks for TLS, HTTP headers, cookies, CORS, and exposed files, plus OSINT lookups using WHOIS/RDAP, DNS, certificate transparency, and Wayback.</w:t>
-      </w:r>
-    </w:p>
-    <w:p>
-      <w:pPr>
-        <w:spacing w:before="60"/>
-      </w:pPr>
-      <w:r>
-        <w:rPr>
-          <w:rFonts w:ascii="Arial" w:hAnsi="Arial" w:eastAsia="Arial" w:cs="Arial"/>
-          <w:b/>
-          <w:sz w:val="18"/>
-        </w:rPr>
-        <w:t>PentestAI</w:t>
+        <w:t>KD_SEC Security Tools</w:t>
       </w:r>
       <w:r>
         <w:rPr>
-          <w:rFonts w:ascii="Arial" w:hAnsi="Arial" w:eastAsia="Arial" w:cs="Arial"/>
+          <w:rFonts w:ascii="Times New Roman" w:hAnsi="Times New Roman" w:eastAsia="Times New Roman" w:cs="Times New Roman"/>
+          <w:color w:val="000000"/>
           <w:sz w:val="18"/>
         </w:rPr>
-        <w:t xml:space="preserve"> | Design-stage project</w:t>
+        <w:t xml:space="preserve"> | Built passive TLS, HTTP header, cookie, CORS, and exposed-file checks, plus OSINT lookups using WHOIS/RDAP, DNS, certificate transparency, and Wayback.</w:t>
       </w:r>
     </w:p>
     <w:p>
@@ -502,37 +504,28 @@
       </w:pPr>
       <w:r>
         <w:rPr>
-          <w:rFonts w:ascii="Arial" w:hAnsi="Arial" w:eastAsia="Arial" w:cs="Arial"/>
+          <w:rFonts w:ascii="Times New Roman" w:hAnsi="Times New Roman" w:eastAsia="Times New Roman" w:cs="Times New Roman"/>
+          <w:color w:val="000000"/>
           <w:sz w:val="18"/>
         </w:rPr>
-        <w:t xml:space="preserve">- </w:t>
+        <w:t xml:space="preserve">• </w:t>
       </w:r>
       <w:r>
         <w:rPr>
-          <w:rFonts w:ascii="Arial" w:hAnsi="Arial" w:eastAsia="Arial" w:cs="Arial"/>
+          <w:rFonts w:ascii="Times New Roman" w:hAnsi="Times New Roman" w:eastAsia="Times New Roman" w:cs="Times New Roman"/>
+          <w:b/>
+          <w:color w:val="000000"/>
           <w:sz w:val="18"/>
         </w:rPr>
-        <w:t>Documented architecture for an AI-assisted web penetration testing platform with verification and evidence requirements.</w:t>
-      </w:r>
-    </w:p>
-    <w:p>
-      <w:pPr>
-        <w:spacing w:before="60"/>
-      </w:pPr>
-      <w:r>
-        <w:rPr>
-          <w:rFonts w:ascii="Arial" w:hAnsi="Arial" w:eastAsia="Arial" w:cs="Arial"/>
-          <w:b/>
-          <w:sz w:val="18"/>
-        </w:rPr>
-        <w:t>HackShield</w:t>
+        <w:t>PentestAI (design stage)</w:t>
       </w:r>
       <w:r>
         <w:rPr>
-          <w:rFonts w:ascii="Arial" w:hAnsi="Arial" w:eastAsia="Arial" w:cs="Arial"/>
+          <w:rFonts w:ascii="Times New Roman" w:hAnsi="Times New Roman" w:eastAsia="Times New Roman" w:cs="Times New Roman"/>
+          <w:color w:val="000000"/>
           <w:sz w:val="18"/>
         </w:rPr>
-        <w:t xml:space="preserve"> | Graduation project</w:t>
+        <w:t xml:space="preserve"> | Documented architecture for AI-assisted web penetration testing with verification and evidence requirements.</w:t>
       </w:r>
     </w:p>
     <w:p>
@@ -541,172 +534,455 @@
       </w:pPr>
       <w:r>
         <w:rPr>
-          <w:rFonts w:ascii="Arial" w:hAnsi="Arial" w:eastAsia="Arial" w:cs="Arial"/>
+          <w:rFonts w:ascii="Times New Roman" w:hAnsi="Times New Roman" w:eastAsia="Times New Roman" w:cs="Times New Roman"/>
+          <w:color w:val="000000"/>
           <w:sz w:val="18"/>
         </w:rPr>
-        <w:t xml:space="preserve">- </w:t>
+        <w:t xml:space="preserve">• </w:t>
       </w:r>
       <w:r>
         <w:rPr>
-          <w:rFonts w:ascii="Arial" w:hAnsi="Arial" w:eastAsia="Arial" w:cs="Arial"/>
+          <w:rFonts w:ascii="Times New Roman" w:hAnsi="Times New Roman" w:eastAsia="Times New Roman" w:cs="Times New Roman"/>
+          <w:b/>
+          <w:color w:val="000000"/>
           <w:sz w:val="18"/>
         </w:rPr>
-        <w:t>Developed a gamified cybersecurity training platform with interactive missions and challenges using React, TypeScript, and Supabase.</w:t>
+        <w:t>HackShield (graduation project)</w:t>
+      </w:r>
+      <w:r>
+        <w:rPr>
+          <w:rFonts w:ascii="Times New Roman" w:hAnsi="Times New Roman" w:eastAsia="Times New Roman" w:cs="Times New Roman"/>
+          <w:color w:val="000000"/>
+          <w:sz w:val="18"/>
+        </w:rPr>
+        <w:t xml:space="preserve"> | Developed a gamified cybersecurity training platform with React, TypeScript, and Supabase.</w:t>
       </w:r>
     </w:p>
     <w:p>
       <w:pPr>
         <w:pStyle w:val="ResumeSection"/>
+        <w:pBdr>
+          <w:bottom w:val="single" w:sz="5" w:space="2" w:color="000000"/>
+        </w:pBdr>
       </w:pPr>
       <w:r>
+        <w:rPr>
+          <w:rFonts w:ascii="Times New Roman" w:hAnsi="Times New Roman" w:eastAsia="Times New Roman" w:cs="Times New Roman"/>
+          <w:b/>
+          <w:color w:val="000000"/>
+          <w:sz w:val="20"/>
+        </w:rPr>
         <w:t>EDUCATION</w:t>
+      </w:r>
+    </w:p>
+    <w:p>
+      <w:pPr>
+        <w:pStyle w:val="ResumeEntry"/>
+      </w:pPr>
+      <w:r>
+        <w:rPr>
+          <w:rFonts w:ascii="Times New Roman" w:hAnsi="Times New Roman" w:eastAsia="Times New Roman" w:cs="Times New Roman"/>
+          <w:b/>
+          <w:color w:val="000000"/>
+          <w:sz w:val="19"/>
+        </w:rPr>
+        <w:t>Astana IT University</w:t>
+      </w:r>
+      <w:r>
+        <w:rPr>
+          <w:rFonts w:ascii="Times New Roman" w:hAnsi="Times New Roman" w:eastAsia="Times New Roman" w:cs="Times New Roman"/>
+          <w:color w:val="000000"/>
+          <w:sz w:val="19"/>
+        </w:rPr>
+        <w:t xml:space="preserve"> | Astana, Kazakhstan</w:t>
+      </w:r>
+      <w:r>
+        <w:rPr>
+          <w:rFonts w:ascii="Times New Roman" w:hAnsi="Times New Roman" w:eastAsia="Times New Roman" w:cs="Times New Roman"/>
+          <w:i/>
+          <w:color w:val="000000"/>
+          <w:sz w:val="18"/>
+        </w:rPr>
+        <w:tab/>
+        <w:t>30 Jun 2026</w:t>
       </w:r>
     </w:p>
     <w:p>
       <w:r>
         <w:rPr>
-          <w:rFonts w:ascii="Arial" w:hAnsi="Arial" w:eastAsia="Arial" w:cs="Arial"/>
-          <w:b/>
-          <w:sz w:val="18"/>
+          <w:rFonts w:ascii="Times New Roman" w:hAnsi="Times New Roman" w:eastAsia="Times New Roman" w:cs="Times New Roman"/>
+          <w:i/>
+          <w:color w:val="000000"/>
+          <w:sz w:val="19"/>
         </w:rPr>
-        <w:t>Bachelor's Degree in Cybersecurity</w:t>
-      </w:r>
-      <w:r>
-        <w:rPr>
-          <w:rFonts w:ascii="Arial" w:hAnsi="Arial" w:eastAsia="Arial" w:cs="Arial"/>
-          <w:sz w:val="18"/>
-        </w:rPr>
-        <w:t xml:space="preserve"> | Astana IT University, 2026</w:t>
+        <w:t>Bachelor's Degree in Cybersecurity (6B06106)</w:t>
       </w:r>
     </w:p>
     <w:p>
       <w:pPr>
         <w:pStyle w:val="ResumeSection"/>
+        <w:pBdr>
+          <w:bottom w:val="single" w:sz="5" w:space="2" w:color="000000"/>
+        </w:pBdr>
       </w:pPr>
       <w:r>
+        <w:rPr>
+          <w:rFonts w:ascii="Times New Roman" w:hAnsi="Times New Roman" w:eastAsia="Times New Roman" w:cs="Times New Roman"/>
+          <w:b/>
+          <w:color w:val="000000"/>
+          <w:sz w:val="20"/>
+        </w:rPr>
         <w:t>CERTIFICATIONS AND TRAINING</w:t>
       </w:r>
     </w:p>
     <w:p>
+      <w:pPr>
+        <w:pStyle w:val="ResumeCertificate"/>
+      </w:pPr>
       <w:r>
         <w:rPr>
-          <w:rFonts w:ascii="Arial" w:hAnsi="Arial" w:eastAsia="Arial" w:cs="Arial"/>
+          <w:rFonts w:ascii="Times New Roman" w:hAnsi="Times New Roman" w:eastAsia="Times New Roman" w:cs="Times New Roman"/>
+          <w:color w:val="000000"/>
+          <w:sz w:val="18"/>
+        </w:rPr>
+        <w:t xml:space="preserve">• </w:t>
+      </w:r>
+      <w:r>
+        <w:rPr>
+          <w:rFonts w:ascii="Times New Roman" w:hAnsi="Times New Roman" w:eastAsia="Times New Roman" w:cs="Times New Roman"/>
           <w:b/>
+          <w:color w:val="000000"/>
           <w:sz w:val="18"/>
         </w:rPr>
         <w:t>Certified Practitioner in Prompt Injection and Input Integrity</w:t>
       </w:r>
       <w:r>
         <w:rPr>
-          <w:rFonts w:ascii="Arial" w:hAnsi="Arial" w:eastAsia="Arial" w:cs="Arial"/>
+          <w:rFonts w:ascii="Times New Roman" w:hAnsi="Times New Roman" w:eastAsia="Times New Roman" w:cs="Times New Roman"/>
+          <w:color w:val="000000"/>
           <w:sz w:val="18"/>
         </w:rPr>
-        <w:t xml:space="preserve"> | DarkControl Certify, practitioner level, 15 Oct 2026</w:t>
+        <w:t xml:space="preserve"> | DarkControl Certify; practitioner exam; 15 Oct 2026</w:t>
       </w:r>
     </w:p>
     <w:p>
       <w:pPr>
-        <w:spacing w:before="20"/>
+        <w:pStyle w:val="ResumeCertificate"/>
       </w:pPr>
       <w:r>
         <w:rPr>
-          <w:rFonts w:ascii="Arial" w:hAnsi="Arial" w:eastAsia="Arial" w:cs="Arial"/>
+          <w:rFonts w:ascii="Times New Roman" w:hAnsi="Times New Roman" w:eastAsia="Times New Roman" w:cs="Times New Roman"/>
+          <w:color w:val="000000"/>
+          <w:sz w:val="18"/>
+        </w:rPr>
+        <w:t xml:space="preserve">• </w:t>
+      </w:r>
+      <w:r>
+        <w:rPr>
+          <w:rFonts w:ascii="Times New Roman" w:hAnsi="Times New Roman" w:eastAsia="Times New Roman" w:cs="Times New Roman"/>
           <w:b/>
+          <w:color w:val="000000"/>
           <w:sz w:val="18"/>
         </w:rPr>
         <w:t>CyberShield Certified SOC Analyst (CSCSA)</w:t>
       </w:r>
       <w:r>
         <w:rPr>
-          <w:rFonts w:ascii="Arial" w:hAnsi="Arial" w:eastAsia="Arial" w:cs="Arial"/>
+          <w:rFonts w:ascii="Times New Roman" w:hAnsi="Times New Roman" w:eastAsia="Times New Roman" w:cs="Times New Roman"/>
+          <w:color w:val="000000"/>
           <w:sz w:val="18"/>
         </w:rPr>
-        <w:t xml:space="preserve"> | CyberShield Academy / State Technical Service</w:t>
+        <w:t xml:space="preserve"> | CyberShield Academy / State Technical Service; qualifying exam</w:t>
       </w:r>
     </w:p>
     <w:p>
       <w:pPr>
-        <w:spacing w:before="20"/>
+        <w:pStyle w:val="ResumeCertificate"/>
       </w:pPr>
       <w:r>
         <w:rPr>
-          <w:rFonts w:ascii="Arial" w:hAnsi="Arial" w:eastAsia="Arial" w:cs="Arial"/>
+          <w:rFonts w:ascii="Times New Roman" w:hAnsi="Times New Roman" w:eastAsia="Times New Roman" w:cs="Times New Roman"/>
+          <w:color w:val="000000"/>
+          <w:sz w:val="18"/>
+        </w:rPr>
+        <w:t xml:space="preserve">• </w:t>
+      </w:r>
+      <w:r>
+        <w:rPr>
+          <w:rFonts w:ascii="Times New Roman" w:hAnsi="Times New Roman" w:eastAsia="Times New Roman" w:cs="Times New Roman"/>
           <w:b/>
+          <w:color w:val="000000"/>
           <w:sz w:val="18"/>
         </w:rPr>
         <w:t>Introduction to AI Security</w:t>
       </w:r>
       <w:r>
         <w:rPr>
-          <w:rFonts w:ascii="Arial" w:hAnsi="Arial" w:eastAsia="Arial" w:cs="Arial"/>
+          <w:rFonts w:ascii="Times New Roman" w:hAnsi="Times New Roman" w:eastAsia="Times New Roman" w:cs="Times New Roman"/>
+          <w:color w:val="000000"/>
           <w:sz w:val="18"/>
         </w:rPr>
-        <w:t xml:space="preserve"> | AI Security University, 2-hour course completion, 29 Sep 2026</w:t>
+        <w:t xml:space="preserve"> | AISEC University; course completion, 2 hours; 29 Sep 2026</w:t>
       </w:r>
     </w:p>
     <w:p>
       <w:pPr>
-        <w:spacing w:before="20"/>
+        <w:pStyle w:val="ResumeCertificate"/>
       </w:pPr>
       <w:r>
         <w:rPr>
-          <w:rFonts w:ascii="Arial" w:hAnsi="Arial" w:eastAsia="Arial" w:cs="Arial"/>
+          <w:rFonts w:ascii="Times New Roman" w:hAnsi="Times New Roman" w:eastAsia="Times New Roman" w:cs="Times New Roman"/>
+          <w:color w:val="000000"/>
+          <w:sz w:val="18"/>
+        </w:rPr>
+        <w:t xml:space="preserve">• </w:t>
+      </w:r>
+      <w:r>
+        <w:rPr>
+          <w:rFonts w:ascii="Times New Roman" w:hAnsi="Times New Roman" w:eastAsia="Times New Roman" w:cs="Times New Roman"/>
           <w:b/>
+          <w:color w:val="000000"/>
           <w:sz w:val="18"/>
         </w:rPr>
         <w:t>Red Hat System Administration I (RH124)</w:t>
       </w:r>
       <w:r>
         <w:rPr>
-          <w:rFonts w:ascii="Arial" w:hAnsi="Arial" w:eastAsia="Arial" w:cs="Arial"/>
+          <w:rFonts w:ascii="Times New Roman" w:hAnsi="Times New Roman" w:eastAsia="Times New Roman" w:cs="Times New Roman"/>
+          <w:color w:val="000000"/>
           <w:sz w:val="18"/>
         </w:rPr>
-        <w:t xml:space="preserve"> | Red Hat, certificate of attendance, 11 Jul 2025</w:t>
+        <w:t xml:space="preserve"> | Red Hat; certificate of attendance; 11 Jul 2025</w:t>
       </w:r>
     </w:p>
     <w:p>
       <w:pPr>
-        <w:spacing w:before="20"/>
+        <w:pStyle w:val="ResumeCertificate"/>
       </w:pPr>
       <w:r>
         <w:rPr>
-          <w:rFonts w:ascii="Arial" w:hAnsi="Arial" w:eastAsia="Arial" w:cs="Arial"/>
-          <w:b/>
+          <w:rFonts w:ascii="Times New Roman" w:hAnsi="Times New Roman" w:eastAsia="Times New Roman" w:cs="Times New Roman"/>
+          <w:color w:val="000000"/>
           <w:sz w:val="18"/>
         </w:rPr>
-        <w:t xml:space="preserve">LearnQuest / Coursera course certificates (6 Feb 2025): </w:t>
+        <w:t xml:space="preserve">• </w:t>
       </w:r>
       <w:r>
         <w:rPr>
-          <w:rFonts w:ascii="Arial" w:hAnsi="Arial" w:eastAsia="Arial" w:cs="Arial"/>
+          <w:rFonts w:ascii="Times New Roman" w:hAnsi="Times New Roman" w:eastAsia="Times New Roman" w:cs="Times New Roman"/>
+          <w:b/>
+          <w:color w:val="000000"/>
           <w:sz w:val="18"/>
         </w:rPr>
-        <w:t>Securing Cloud and Hybrid Networks; Next-Generation Firewalls and Intrusion Prevention.</w:t>
+        <w:t>Securing Cloud and Hybrid Networks</w:t>
+      </w:r>
+      <w:r>
+        <w:rPr>
+          <w:rFonts w:ascii="Times New Roman" w:hAnsi="Times New Roman" w:eastAsia="Times New Roman" w:cs="Times New Roman"/>
+          <w:color w:val="000000"/>
+          <w:sz w:val="18"/>
+        </w:rPr>
+        <w:t xml:space="preserve"> | LearnQuest / Coursera; course completion; 6 Feb 2025</w:t>
       </w:r>
     </w:p>
     <w:p>
       <w:pPr>
-        <w:spacing w:before="20"/>
+        <w:pStyle w:val="ResumeCertificate"/>
       </w:pPr>
       <w:r>
         <w:rPr>
-          <w:rFonts w:ascii="Arial" w:hAnsi="Arial" w:eastAsia="Arial" w:cs="Arial"/>
-          <w:b/>
+          <w:rFonts w:ascii="Times New Roman" w:hAnsi="Times New Roman" w:eastAsia="Times New Roman" w:cs="Times New Roman"/>
+          <w:color w:val="000000"/>
           <w:sz w:val="18"/>
         </w:rPr>
-        <w:t xml:space="preserve">IBM / Coursera course certificates (6 Feb 2025): </w:t>
+        <w:t xml:space="preserve">• </w:t>
       </w:r>
       <w:r>
         <w:rPr>
-          <w:rFonts w:ascii="Arial" w:hAnsi="Arial" w:eastAsia="Arial" w:cs="Arial"/>
+          <w:rFonts w:ascii="Times New Roman" w:hAnsi="Times New Roman" w:eastAsia="Times New Roman" w:cs="Times New Roman"/>
+          <w:b/>
+          <w:color w:val="000000"/>
           <w:sz w:val="18"/>
         </w:rPr>
-        <w:t>Exploratory Data Analysis for Machine Learning; Supervised Machine Learning: Regression.</w:t>
+        <w:t>Next-Generation Firewalls and Intrusion Prevention</w:t>
+      </w:r>
+      <w:r>
+        <w:rPr>
+          <w:rFonts w:ascii="Times New Roman" w:hAnsi="Times New Roman" w:eastAsia="Times New Roman" w:cs="Times New Roman"/>
+          <w:color w:val="000000"/>
+          <w:sz w:val="18"/>
+        </w:rPr>
+        <w:t xml:space="preserve"> | LearnQuest / Coursera; course completion; 6 Feb 2025</w:t>
+      </w:r>
+    </w:p>
+    <w:p>
+      <w:pPr>
+        <w:pStyle w:val="ResumeCertificate"/>
+      </w:pPr>
+      <w:r>
+        <w:rPr>
+          <w:rFonts w:ascii="Times New Roman" w:hAnsi="Times New Roman" w:eastAsia="Times New Roman" w:cs="Times New Roman"/>
+          <w:color w:val="000000"/>
+          <w:sz w:val="18"/>
+        </w:rPr>
+        <w:t xml:space="preserve">• </w:t>
+      </w:r>
+      <w:r>
+        <w:rPr>
+          <w:rFonts w:ascii="Times New Roman" w:hAnsi="Times New Roman" w:eastAsia="Times New Roman" w:cs="Times New Roman"/>
+          <w:b/>
+          <w:color w:val="000000"/>
+          <w:sz w:val="18"/>
+        </w:rPr>
+        <w:t>Exploratory Data Analysis for Machine Learning</w:t>
+      </w:r>
+      <w:r>
+        <w:rPr>
+          <w:rFonts w:ascii="Times New Roman" w:hAnsi="Times New Roman" w:eastAsia="Times New Roman" w:cs="Times New Roman"/>
+          <w:color w:val="000000"/>
+          <w:sz w:val="18"/>
+        </w:rPr>
+        <w:t xml:space="preserve"> | IBM / Coursera; course completion; 6 Feb 2025</w:t>
+      </w:r>
+    </w:p>
+    <w:p>
+      <w:pPr>
+        <w:pStyle w:val="ResumeCertificate"/>
+      </w:pPr>
+      <w:r>
+        <w:rPr>
+          <w:rFonts w:ascii="Times New Roman" w:hAnsi="Times New Roman" w:eastAsia="Times New Roman" w:cs="Times New Roman"/>
+          <w:color w:val="000000"/>
+          <w:sz w:val="18"/>
+        </w:rPr>
+        <w:t xml:space="preserve">• </w:t>
+      </w:r>
+      <w:r>
+        <w:rPr>
+          <w:rFonts w:ascii="Times New Roman" w:hAnsi="Times New Roman" w:eastAsia="Times New Roman" w:cs="Times New Roman"/>
+          <w:b/>
+          <w:color w:val="000000"/>
+          <w:sz w:val="18"/>
+        </w:rPr>
+        <w:t>Supervised Machine Learning: Regression</w:t>
+      </w:r>
+      <w:r>
+        <w:rPr>
+          <w:rFonts w:ascii="Times New Roman" w:hAnsi="Times New Roman" w:eastAsia="Times New Roman" w:cs="Times New Roman"/>
+          <w:color w:val="000000"/>
+          <w:sz w:val="18"/>
+        </w:rPr>
+        <w:t xml:space="preserve"> | IBM / Coursera; course completion; 6 Feb 2025</w:t>
+      </w:r>
+    </w:p>
+    <w:p>
+      <w:pPr>
+        <w:pStyle w:val="ResumeSection"/>
+        <w:pBdr>
+          <w:bottom w:val="single" w:sz="5" w:space="2" w:color="000000"/>
+        </w:pBdr>
+      </w:pPr>
+      <w:r>
+        <w:rPr>
+          <w:rFonts w:ascii="Times New Roman" w:hAnsi="Times New Roman" w:eastAsia="Times New Roman" w:cs="Times New Roman"/>
+          <w:b/>
+          <w:color w:val="000000"/>
+          <w:sz w:val="20"/>
+        </w:rPr>
+        <w:t>SKILLS AND LANGUAGES</w:t>
+      </w:r>
+    </w:p>
+    <w:p>
+      <w:pPr>
+        <w:pStyle w:val="ResumeSkill"/>
+      </w:pPr>
+      <w:r>
+        <w:rPr>
+          <w:rFonts w:ascii="Times New Roman" w:hAnsi="Times New Roman" w:eastAsia="Times New Roman" w:cs="Times New Roman"/>
+          <w:b/>
+          <w:color w:val="000000"/>
+          <w:sz w:val="18"/>
+        </w:rPr>
+        <w:t xml:space="preserve">AI security testing: </w:t>
+      </w:r>
+      <w:r>
+        <w:rPr>
+          <w:rFonts w:ascii="Times New Roman" w:hAnsi="Times New Roman" w:eastAsia="Times New Roman" w:cs="Times New Roman"/>
+          <w:color w:val="000000"/>
+          <w:sz w:val="18"/>
+        </w:rPr>
+        <w:t>Prompt injection, adversarial inputs, attack scenarios, reproducible test cases, vulnerability analysis</w:t>
+      </w:r>
+    </w:p>
+    <w:p>
+      <w:pPr>
+        <w:pStyle w:val="ResumeSkill"/>
+      </w:pPr>
+      <w:r>
+        <w:rPr>
+          <w:rFonts w:ascii="Times New Roman" w:hAnsi="Times New Roman" w:eastAsia="Times New Roman" w:cs="Times New Roman"/>
+          <w:b/>
+          <w:color w:val="000000"/>
+          <w:sz w:val="18"/>
+        </w:rPr>
+        <w:t xml:space="preserve">Security operations: </w:t>
+      </w:r>
+      <w:r>
+        <w:rPr>
+          <w:rFonts w:ascii="Times New Roman" w:hAnsi="Times New Roman" w:eastAsia="Times New Roman" w:cs="Times New Roman"/>
+          <w:color w:val="000000"/>
+          <w:sz w:val="18"/>
+        </w:rPr>
+        <w:t>Splunk SIEM, event monitoring, alert triage, log and IOC analysis, network security</w:t>
+      </w:r>
+    </w:p>
+    <w:p>
+      <w:pPr>
+        <w:pStyle w:val="ResumeSkill"/>
+      </w:pPr>
+      <w:r>
+        <w:rPr>
+          <w:rFonts w:ascii="Times New Roman" w:hAnsi="Times New Roman" w:eastAsia="Times New Roman" w:cs="Times New Roman"/>
+          <w:b/>
+          <w:color w:val="000000"/>
+          <w:sz w:val="18"/>
+        </w:rPr>
+        <w:t xml:space="preserve">Tools and scripting: </w:t>
+      </w:r>
+      <w:r>
+        <w:rPr>
+          <w:rFonts w:ascii="Times New Roman" w:hAnsi="Times New Roman" w:eastAsia="Times New Roman" w:cs="Times New Roman"/>
+          <w:color w:val="000000"/>
+          <w:sz w:val="18"/>
+        </w:rPr>
+        <w:t>Python, Docker, command-line tools, YAML, Linux, Git, Wireshark</w:t>
+      </w:r>
+    </w:p>
+    <w:p>
+      <w:pPr>
+        <w:pStyle w:val="ResumeSkill"/>
+      </w:pPr>
+      <w:r>
+        <w:rPr>
+          <w:rFonts w:ascii="Times New Roman" w:hAnsi="Times New Roman" w:eastAsia="Times New Roman" w:cs="Times New Roman"/>
+          <w:b/>
+          <w:color w:val="000000"/>
+          <w:sz w:val="18"/>
+        </w:rPr>
+        <w:t xml:space="preserve">Languages: </w:t>
+      </w:r>
+      <w:r>
+        <w:rPr>
+          <w:rFonts w:ascii="Times New Roman" w:hAnsi="Times New Roman" w:eastAsia="Times New Roman" w:cs="Times New Roman"/>
+          <w:color w:val="000000"/>
+          <w:sz w:val="18"/>
+        </w:rPr>
+        <w:t>Kazakh (native), Russian (C1), English (B1), Chinese (HSK 5)</w:t>
       </w:r>
     </w:p>
     <w:sectPr>
       <w:pgSz w:w="11909" w:h="16834"/>
-      <w:pgMar w:top="806" w:right="979" w:bottom="749" w:left="979" w:header="720" w:footer="720" w:gutter="0"/>
+      <w:pgMar w:top="662" w:right="950" w:bottom="619" w:left="950" w:header="720" w:footer="720" w:gutter="0"/>
       <w:cols w:space="720"/>
       <w:docGrid w:linePitch="360"/>
     </w:sectPr>
@@ -1078,12 +1354,12 @@
     <w:qFormat/>
     <w:rsid w:val="00FC693F"/>
     <w:pPr>
-      <w:spacing w:after="0" w:line="252" w:lineRule="auto"/>
+      <w:spacing w:after="0" w:line="259" w:lineRule="auto"/>
     </w:pPr>
     <w:rPr>
-      <w:rFonts w:ascii="Arial" w:hAnsi="Arial"/>
-      <w:color w:val="111827"/>
-      <w:sz w:val="18"/>
+      <w:rFonts w:ascii="Times New Roman" w:hAnsi="Times New Roman"/>
+      <w:color w:val="000000"/>
+      <w:sz w:val="19"/>
     </w:rPr>
   </w:style>
   <w:style w:type="paragraph" w:styleId="Header">
@@ -1427,16 +1703,16 @@
     <w:qFormat/>
     <w:rsid w:val="00FC693F"/>
     <w:pPr>
-      <w:spacing w:after="20" w:line="240" w:lineRule="auto"/>
+      <w:spacing w:after="0" w:line="240" w:lineRule="auto"/>
       <w:contextualSpacing/>
     </w:pPr>
     <w:rPr>
-      <w:rFonts w:asciiTheme="majorHAnsi" w:eastAsiaTheme="majorEastAsia" w:hAnsiTheme="majorHAnsi" w:cstheme="majorBidi" w:ascii="Arial" w:hAnsi="Arial"/>
+      <w:rFonts w:asciiTheme="majorHAnsi" w:eastAsiaTheme="majorEastAsia" w:hAnsiTheme="majorHAnsi" w:cstheme="majorBidi" w:ascii="Times New Roman" w:hAnsi="Times New Roman"/>
       <w:b/>
       <w:color w:val="000000"/>
       <w:spacing w:val="5"/>
       <w:kern w:val="28"/>
-      <w:sz w:val="35"/>
+      <w:sz w:val="37"/>
       <w:szCs w:val="52"/>
     </w:rPr>
   </w:style>
@@ -12770,13 +13046,13 @@
     <w:name w:val="Resume Subtitle"/>
     <w:basedOn w:val="Normal"/>
     <w:pPr>
-      <w:spacing w:after="80"/>
+      <w:spacing w:after="60" w:line="240" w:lineRule="auto"/>
     </w:pPr>
     <w:rPr>
-      <w:rFonts w:ascii="Arial" w:hAnsi="Arial"/>
-      <w:b/>
-      <w:color w:val="2B4058"/>
-      <w:sz w:val="19"/>
+      <w:rFonts w:ascii="Times New Roman" w:hAnsi="Times New Roman"/>
+      <w:i/>
+      <w:color w:val="000000"/>
+      <w:sz w:val="18"/>
     </w:rPr>
   </w:style>
   <w:style w:type="paragraph" w:customStyle="1" w:styleId="ResumeContact">
@@ -12786,9 +13062,9 @@
       <w:spacing w:after="0" w:line="240" w:lineRule="auto"/>
     </w:pPr>
     <w:rPr>
-      <w:rFonts w:ascii="Arial" w:hAnsi="Arial"/>
-      <w:color w:val="2B4058"/>
-      <w:sz w:val="18"/>
+      <w:rFonts w:ascii="Times New Roman" w:hAnsi="Times New Roman"/>
+      <w:color w:val="000000"/>
+      <w:sz w:val="17"/>
     </w:rPr>
   </w:style>
   <w:style w:type="paragraph" w:customStyle="1" w:styleId="ResumeSection">
@@ -12796,32 +13072,46 @@
     <w:basedOn w:val="Normal"/>
     <w:pPr>
       <w:keepNext/>
-      <w:spacing w:before="170" w:after="60"/>
+      <w:spacing w:before="180" w:after="70"/>
     </w:pPr>
     <w:rPr>
-      <w:rFonts w:ascii="Arial" w:hAnsi="Arial"/>
+      <w:rFonts w:ascii="Times New Roman" w:hAnsi="Times New Roman"/>
       <w:b/>
       <w:color w:val="000000"/>
-      <w:sz w:val="18"/>
+      <w:sz w:val="20"/>
     </w:rPr>
   </w:style>
-  <w:style w:type="paragraph" w:customStyle="1" w:styleId="ResumeJob">
-    <w:name w:val="Resume Job"/>
+  <w:style w:type="paragraph" w:customStyle="1" w:styleId="ResumeEntry">
+    <w:name w:val="Resume Entry"/>
     <w:basedOn w:val="Normal"/>
     <w:pPr>
       <w:keepNext/>
       <w:tabs>
-        <w:tab w:pos="9936" w:val="right"/>
+        <w:tab w:pos="9994" w:val="right"/>
       </w:tabs>
-      <w:spacing w:before="80" w:after="20"/>
+      <w:spacing w:before="60" w:after="16"/>
     </w:pPr>
   </w:style>
   <w:style w:type="paragraph" w:customStyle="1" w:styleId="ResumeBullet">
     <w:name w:val="Resume Bullet"/>
     <w:basedOn w:val="Normal"/>
     <w:pPr>
-      <w:spacing w:after="20" w:line="247" w:lineRule="auto"/>
-      <w:ind w:left="230" w:hanging="230"/>
+      <w:spacing w:after="14" w:line="259" w:lineRule="auto"/>
+      <w:ind w:left="245" w:hanging="173"/>
+    </w:pPr>
+  </w:style>
+  <w:style w:type="paragraph" w:customStyle="1" w:styleId="ResumeCertificate">
+    <w:name w:val="Resume Certificate"/>
+    <w:basedOn w:val="ResumeBullet"/>
+    <w:pPr>
+      <w:spacing w:after="6" w:line="252" w:lineRule="auto"/>
+    </w:pPr>
+  </w:style>
+  <w:style w:type="paragraph" w:customStyle="1" w:styleId="ResumeSkill">
+    <w:name w:val="Resume Skill"/>
+    <w:basedOn w:val="Normal"/>
+    <w:pPr>
+      <w:spacing w:after="14" w:line="259" w:lineRule="auto"/>
     </w:pPr>
   </w:style>
 </w:styles>

</xml_diff>